<commit_message>
Fix PII detector edge cases
</commit_message>
<xml_diff>
--- a/outputs/evaluation_report_submission.docx
+++ b/outputs/evaluation_report_submission.docx
@@ -54,7 +54,7 @@
     </w:p>
     <w:p>
       <w:r>
-        <w:t>These are entity-level set metrics measured against the controlled fixture ground truth.</w:t>
+        <w:t>These are entity-level set metrics measured against the controlled fixture ground truth. They are not claimed as real-world benchmark accuracy.</w:t>
       </w:r>
     </w:p>
     <w:p>
@@ -62,7 +62,7 @@
         <w:pStyle w:val="ListBullet"/>
       </w:pPr>
       <w:r>
-        <w:t>True positives: 19</w:t>
+        <w:t>True positives: 22</w:t>
       </w:r>
     </w:p>
     <w:p>
@@ -117,7 +117,7 @@
     </w:p>
     <w:p>
       <w:r>
-        <w:t>address    2    0    0    100.00%    100.00%    100.00%</w:t>
+        <w:t>address    3    0    0    100.00%    100.00%    100.00%</w:t>
       </w:r>
     </w:p>
     <w:p>
@@ -142,7 +142,7 @@
     </w:p>
     <w:p>
       <w:r>
-        <w:t>ip_address    2    0    0    100.00%    100.00%    100.00%</w:t>
+        <w:t>ip_address    3    0    0    100.00%    100.00%    100.00%</w:t>
       </w:r>
     </w:p>
     <w:p>
@@ -152,7 +152,7 @@
     </w:p>
     <w:p>
       <w:r>
-        <w:t>phone    2    0    0    100.00%    100.00%    100.00%</w:t>
+        <w:t>phone    3    0    0    100.00%    100.00%    100.00%</w:t>
       </w:r>
     </w:p>
     <w:p>
@@ -173,7 +173,7 @@
         <w:pStyle w:val="ListBullet"/>
       </w:pPr>
       <w:r>
-        <w:t>Total replacements: 317</w:t>
+        <w:t>Total replacements: 321</w:t>
       </w:r>
     </w:p>
     <w:p>
@@ -256,7 +256,7 @@
     </w:p>
     <w:p>
       <w:r>
-        <w:t>phone    1</w:t>
+        <w:t>phone    5</w:t>
       </w:r>
     </w:p>
     <w:p>

</xml_diff>

<commit_message>
Improve company detection precision
</commit_message>
<xml_diff>
--- a/outputs/evaluation_report_submission.docx
+++ b/outputs/evaluation_report_submission.docx
@@ -173,7 +173,7 @@
         <w:pStyle w:val="ListBullet"/>
       </w:pPr>
       <w:r>
-        <w:t>Total replacements: 321</w:t>
+        <w:t>Total replacements: 290</w:t>
       </w:r>
     </w:p>
     <w:p>
@@ -241,7 +241,7 @@
     </w:p>
     <w:p>
       <w:r>
-        <w:t>company    156</w:t>
+        <w:t>company    125</w:t>
       </w:r>
     </w:p>
     <w:p>

</xml_diff>

<commit_message>
Fix uppercase cover page PII redaction
</commit_message>
<xml_diff>
--- a/outputs/evaluation_report_submission.docx
+++ b/outputs/evaluation_report_submission.docx
@@ -173,7 +173,7 @@
         <w:pStyle w:val="ListBullet"/>
       </w:pPr>
       <w:r>
-        <w:t>Total replacements: 290</w:t>
+        <w:t>Total replacements: 354</w:t>
       </w:r>
     </w:p>
     <w:p>
@@ -241,7 +241,7 @@
     </w:p>
     <w:p>
       <w:r>
-        <w:t>company    125</w:t>
+        <w:t>company    130</w:t>
       </w:r>
     </w:p>
     <w:p>
@@ -251,7 +251,7 @@
     </w:p>
     <w:p>
       <w:r>
-        <w:t>person    95</w:t>
+        <w:t>person    154</w:t>
       </w:r>
     </w:p>
     <w:p>

</xml_diff>